<commit_message>
feat: Add AWS Serverless Ingestion, Postgres Schema, & EPA WQX standards to File 57 & rebuild docs
</commit_message>
<xml_diff>
--- a/09_Operations_&_Technical_Playbooks/57_Off_Grid_Hydrological_Telemetry_&_Data_Sharing_API_Infrastructure.docx
+++ b/09_Operations_&_Technical_Playbooks/57_Off_Grid_Hydrological_Telemetry_&_Data_Sharing_API_Infrastructure.docx
@@ -804,11 +804,879 @@
         <w:br/>
         <w:t xml:space="preserve">            print("Successfully mirrored stream telemetry to UGA Warnell research nodes.")</w:t>
         <w:br/>
+        <w:t xml:space="preserve">    except requests.exceptions.RequestException as e:</w:t>
+        <w:br/>
+        <w:t xml:space="preserve">        print(f"Data-sharing API connection timed out: {e}")</w:t>
+      </w:r>
+    </w:p>
+    <w:p>
+      <w:pPr>
+        <w:spacing w:after="240"/>
+      </w:pPr>
+      <w:r>
+        <w:rPr>
+          <w:color w:val="D9D9D9"/>
+        </w:rPr>
+        <w:t>____________________________________________________</w:t>
+      </w:r>
+    </w:p>
+    <w:p>
+      <w:pPr>
+        <w:spacing w:before="360" w:after="120"/>
+      </w:pPr>
+      <w:r>
+        <w:rPr>
+          <w:b/>
+          <w:color w:val="2E75B6"/>
+          <w:sz w:val="32"/>
+        </w:rPr>
+        <w:t>VI. AWS Cloud Data Architecture &amp; Postgres Database Schema</w:t>
+      </w:r>
+    </w:p>
+    <w:p>
+      <w:r>
+        <w:t xml:space="preserve">To scale our streamside telemetry network across multiple North Georgia watersheds, we deploy a low-cost, highly secure, and extremely reliable </w:t>
+      </w:r>
+      <w:r>
+        <w:rPr>
+          <w:b/>
+        </w:rPr>
+        <w:t>AWS Serverless &amp; Relational Data Ingestion Architecture</w:t>
+      </w:r>
+      <w:r>
+        <w:t xml:space="preserve">. This setup routes parsed geomorphic and chemical parameters from our base gateways into a managed </w:t>
+      </w:r>
+      <w:r>
+        <w:rPr>
+          <w:b/>
+        </w:rPr>
+        <w:t>Amazon RDS PostgreSQL database</w:t>
+      </w:r>
+      <w:r>
+        <w:t xml:space="preserve"> with the </w:t>
+      </w:r>
+      <w:r>
+        <w:rPr>
+          <w:b/>
+        </w:rPr>
+        <w:t>TimescaleDB extension</w:t>
+      </w:r>
+      <w:r>
+        <w:t xml:space="preserve"> enabled, ensuring high-speed time-series queries.</w:t>
+      </w:r>
+    </w:p>
+    <w:p>
+      <w:pPr>
+        <w:spacing w:before="240" w:after="80"/>
+      </w:pPr>
+      <w:r>
+        <w:rPr>
+          <w:b/>
+          <w:color w:val="595959"/>
+          <w:sz w:val="26"/>
+        </w:rPr>
+        <w:t>1. AWS Cloud Data Flow Diagram</w:t>
+      </w:r>
+    </w:p>
+    <w:p>
+      <w:r>
+        <w:t>The data flows through secure AWS endpoints using lightweight serverless components to keep running costs under $10 USD per month:</w:t>
+      </w:r>
+    </w:p>
+    <w:p>
+      <w:pPr>
+        <w:spacing w:before="120" w:after="120"/>
+        <w:ind w:left="360"/>
+      </w:pPr>
+      <w:r>
+        <w:rPr>
+          <w:rFonts w:ascii="Consolas" w:hAnsi="Consolas"/>
+          <w:color w:val="7F0055"/>
+          <w:sz w:val="19"/>
+        </w:rPr>
+        <w:t xml:space="preserve">                          [AWS SERVERLESS DATA INGESTION FLOW]</w:t>
+        <w:br/>
+        <w:br/>
+        <w:t xml:space="preserve">    +-----------------------------------------------------------------------+</w:t>
+        <w:br/>
+        <w:t xml:space="preserve">    | BASE STATION GATEWAY (Hunter's Cabin Node-RED / Python Sync Client)    |</w:t>
+        <w:br/>
+        <w:t xml:space="preserve">    +----------------------------------|------------------------------------+</w:t>
+        <w:br/>
+        <w:t xml:space="preserve">                                       |</w:t>
+        <w:br/>
+        <w:t xml:space="preserve">                                HTTPS POST Payload</w:t>
+        <w:br/>
+        <w:t xml:space="preserve">                                       v</w:t>
+        <w:br/>
+        <w:t xml:space="preserve">    +-----------------------------------------------------------------------+</w:t>
+        <w:br/>
+        <w:t xml:space="preserve">    | AWS API GATEWAY (Secured REST Endpoint w/ IAM &amp; API Keys)             |</w:t>
+        <w:br/>
+        <w:t xml:space="preserve">    +----------------------------------|------------------------------------+</w:t>
+        <w:br/>
+        <w:t xml:space="preserve">                                       |</w:t>
+        <w:br/>
+        <w:t xml:space="preserve">                                  JSON Ingress</w:t>
+        <w:br/>
+        <w:t xml:space="preserve">                                       v</w:t>
+        <w:br/>
+        <w:t xml:space="preserve">    +-----------------------------------------------------------------------+</w:t>
+        <w:br/>
+        <w:t xml:space="preserve">    | AWS LAMBDA INGESTION FUNCTION (Python Serverless microservice)        |</w:t>
+        <w:br/>
+        <w:t xml:space="preserve">    |   - Sanitizes and validates chemical and hydrological ranges         |</w:t>
+        <w:br/>
+        <w:t xml:space="preserve">    |   - Calculates oxygen saturation &amp; wading index safety parameters    |</w:t>
+        <w:br/>
+        <w:t xml:space="preserve">    +----------------------------------|------------------------------------+</w:t>
+        <w:br/>
+        <w:t xml:space="preserve">                                       |</w:t>
+        <w:br/>
+        <w:t xml:space="preserve">                                SQL INSERT Query</w:t>
+        <w:br/>
+        <w:t xml:space="preserve">                                       v</w:t>
+        <w:br/>
+        <w:t xml:space="preserve">    +-----------------------------------------------------------------------+</w:t>
+        <w:br/>
+        <w:t xml:space="preserve">    | AMAZON RDS POSTGRESQL + TIMESCALEDB (Secure Managed Database)         |</w:t>
+        <w:br/>
+        <w:t xml:space="preserve">    |   - "stations" table: relational tracking of geomorphic assets       |</w:t>
+        <w:br/>
+        <w:t xml:space="preserve">    |   - "stream_telemetry_logs" hypertable: raw timeseries sweeps         |</w:t>
+        <w:br/>
+        <w:t xml:space="preserve">    +-------------------|-----------------------------------|---------------+</w:t>
+        <w:br/>
+        <w:t xml:space="preserve">                        |                                   |</w:t>
+        <w:br/>
+        <w:t xml:space="preserve">                Reads API queries                   Event Trigger (SNS)</w:t>
+        <w:br/>
+        <w:t xml:space="preserve">                        v                                   v</w:t>
+        <w:br/>
+        <w:t xml:space="preserve">    +---------------------------+                   +-----------------------+</w:t>
+        <w:br/>
+        <w:t xml:space="preserve">    | Public API Gateway GET    |                   | twilio / SNS SMS      |</w:t>
+        <w:br/>
+        <w:t xml:space="preserve">    | (WQP / JSON-LD / Swagger) |                   | Hoot Owl thermal alert|</w:t>
+        <w:br/>
+        <w:t xml:space="preserve">    +---------------------------+                   +-----------------------+</w:t>
+      </w:r>
+    </w:p>
+    <w:p>
+      <w:pPr>
+        <w:spacing w:before="240" w:after="80"/>
+      </w:pPr>
+      <w:r>
+        <w:rPr>
+          <w:b/>
+          <w:color w:val="595959"/>
+          <w:sz w:val="26"/>
+        </w:rPr>
+        <w:t>2. Vetted PostgreSQL Database Relational Schema</w:t>
+      </w:r>
+    </w:p>
+    <w:p>
+      <w:r>
+        <w:t>We utilize PostgreSQL with the TimescaleDB extension to achieve both robust relational integrity (for landowners, HUC-8 basins, and regulatory files) and optimized time-series logging for the 15-minute sensor sweeps. Run these SQL commands to initialize the database:</w:t>
+      </w:r>
+    </w:p>
+    <w:p>
+      <w:pPr>
+        <w:spacing w:before="120" w:after="120"/>
+        <w:ind w:left="360"/>
+      </w:pPr>
+      <w:r>
+        <w:rPr>
+          <w:rFonts w:ascii="Consolas" w:hAnsi="Consolas"/>
+          <w:color w:val="7F0055"/>
+          <w:sz w:val="19"/>
+        </w:rPr>
+        <w:t>-- 1. Enable TimescaleDB extension for timeseries optimization</w:t>
+        <w:br/>
+        <w:t>CREATE EXTENSION IF NOT EXISTS timescaledb CASCADE;</w:t>
+        <w:br/>
+        <w:br/>
+        <w:t>-- 2. Create the parent relational table for station tracking</w:t>
+        <w:br/>
+        <w:t>CREATE TABLE monitoring_stations (</w:t>
+        <w:br/>
+        <w:t xml:space="preserve">    station_id VARCHAR(50) PRIMARY KEY,</w:t>
+        <w:br/>
+        <w:t xml:space="preserve">    watershed_huc_8 VARCHAR(8) NOT NULL,</w:t>
+        <w:br/>
+        <w:t xml:space="preserve">    watershed_name VARCHAR(100) NOT NULL,</w:t>
+        <w:br/>
+        <w:t xml:space="preserve">    location_description TEXT NOT NULL,</w:t>
+        <w:br/>
+        <w:t xml:space="preserve">    latitude DECIMAL(9, 6) NOT NULL,</w:t>
+        <w:br/>
+        <w:t xml:space="preserve">    longitude DECIMAL(9, 6) NOT NULL,</w:t>
+        <w:br/>
+        <w:t xml:space="preserve">    landowner_jv_id VARCHAR(50) NOT NULL,</w:t>
+        <w:br/>
+        <w:t xml:space="preserve">    installation_date DATE NOT NULL,</w:t>
+        <w:br/>
+        <w:t xml:space="preserve">    battery_chemistry VARCHAR(20) DEFAULT 'LiFePO4',</w:t>
+        <w:br/>
+        <w:t xml:space="preserve">    is_active BOOLEAN DEFAULT TRUE,</w:t>
+        <w:br/>
+        <w:t xml:space="preserve">    created_at TIMESTAMP WITH TIME ZONE DEFAULT CURRENT_TIMESTAMP</w:t>
+        <w:br/>
+        <w:t>);</w:t>
+        <w:br/>
+        <w:br/>
+        <w:t>-- 3. Create the timeseries logger table</w:t>
+        <w:br/>
+        <w:t>CREATE TABLE stream_telemetry_logs (</w:t>
+        <w:br/>
+        <w:t xml:space="preserve">    timestamp TIMESTAMP WITH TIME ZONE NOT NULL,</w:t>
+        <w:br/>
+        <w:t xml:space="preserve">    station_id VARCHAR(50) REFERENCES monitoring_stations(station_id),</w:t>
+        <w:br/>
+        <w:t xml:space="preserve">    water_temp_c DECIMAL(4, 2) NOT NULL,</w:t>
+        <w:br/>
+        <w:t xml:space="preserve">    water_temp_f DECIMAL(5, 2) NOT NULL,</w:t>
+        <w:br/>
+        <w:t xml:space="preserve">    dissolved_oxygen_mg_l DECIMAL(4, 2) NOT NULL,</w:t>
+        <w:br/>
+        <w:t xml:space="preserve">    stage_level_m DECIMAL(5, 3) NOT NULL,</w:t>
+        <w:br/>
+        <w:t xml:space="preserve">    turbidity_ntu DECIMAL(5, 1) NOT NULL,</w:t>
+        <w:br/>
+        <w:t xml:space="preserve">    battery_voltage_mv INTEGER NOT NULL,</w:t>
+        <w:br/>
+        <w:t xml:space="preserve">    rssi_dbm SMALLINT NOT NULL,</w:t>
+        <w:br/>
+        <w:t xml:space="preserve">    flow_status VARCHAR(30) NOT NULL,</w:t>
+        <w:br/>
+        <w:t xml:space="preserve">    wading_safety VARCHAR(30) NOT NULL</w:t>
+        <w:br/>
+        <w:t>);</w:t>
+        <w:br/>
+        <w:br/>
+        <w:t>-- 4. Convert stream_telemetry_logs into a TimescaleDB hypertable partitioned by time (7-day chunks)</w:t>
+        <w:br/>
+        <w:t>SELECT create_hypertable('stream_telemetry_logs', 'timestamp', chunk_time_interval =&gt; INTERVAL '7 days');</w:t>
+        <w:br/>
+        <w:br/>
+        <w:t>-- 5. Add compound index for fast time-series queries</w:t>
+        <w:br/>
+        <w:t>CREATE INDEX idx_station_time ON stream_telemetry_logs (station_id, timestamp DESC);</w:t>
+        <w:br/>
+        <w:br/>
+        <w:t>-- 6. Create historical environmental alerts table</w:t>
+        <w:br/>
+        <w:t>CREATE TABLE environmental_alerts (</w:t>
+        <w:br/>
+        <w:t xml:space="preserve">    alert_id SERIAL PRIMARY KEY,</w:t>
+        <w:br/>
+        <w:t xml:space="preserve">    station_id VARCHAR(50) REFERENCES monitoring_stations(station_id),</w:t>
+        <w:br/>
+        <w:t xml:space="preserve">    timestamp TIMESTAMP WITH TIME ZONE NOT NULL,</w:t>
+        <w:br/>
+        <w:t xml:space="preserve">    alert_type VARCHAR(50) NOT NULL, -- e.g., 'HOOT_OWL_THERMAL', 'HAZARDOUS_FLOOD_STAGE'</w:t>
+        <w:br/>
+        <w:t xml:space="preserve">    alert_message TEXT NOT NULL,</w:t>
+        <w:br/>
+        <w:t xml:space="preserve">    is_active BOOLEAN DEFAULT TRUE,</w:t>
+        <w:br/>
+        <w:t xml:space="preserve">    resolved_at TIMESTAMP WITH TIME ZONE</w:t>
+        <w:br/>
+        <w:t>);</w:t>
+      </w:r>
+    </w:p>
+    <w:p>
+      <w:pPr>
+        <w:spacing w:before="240" w:after="80"/>
+      </w:pPr>
+      <w:r>
+        <w:rPr>
+          <w:b/>
+          <w:color w:val="595959"/>
+          <w:sz w:val="26"/>
+        </w:rPr>
+        <w:t>3. Serverless AWS Lambda Ingestion Function (Python 3.11)</w:t>
+      </w:r>
+    </w:p>
+    <w:p>
+      <w:r>
+        <w:t>Deploy this lightweight Python script inside AWS Lambda to handle incoming JSON payloads, sanitize inputs, and write them directly into the Amazon RDS PostgreSQL hypertable:</w:t>
+      </w:r>
+    </w:p>
+    <w:p>
+      <w:pPr>
+        <w:spacing w:before="120" w:after="120"/>
+        <w:ind w:left="360"/>
+      </w:pPr>
+      <w:r>
+        <w:rPr>
+          <w:rFonts w:ascii="Consolas" w:hAnsi="Consolas"/>
+          <w:color w:val="7F0055"/>
+          <w:sz w:val="19"/>
+        </w:rPr>
+        <w:t>import os</w:t>
+        <w:br/>
+        <w:t>import json</w:t>
+        <w:br/>
+        <w:t>import psycopg2</w:t>
+        <w:br/>
+        <w:t>from datetime import datetime</w:t>
+        <w:br/>
+        <w:br/>
+        <w:t># Database Connection Parameters (Set via Lambda Environment Variables)</w:t>
+        <w:br/>
+        <w:t>DB_HOST = os.environ.get('DB_HOST')</w:t>
+        <w:br/>
+        <w:t>DB_NAME = os.environ.get('DB_NAME')</w:t>
+        <w:br/>
+        <w:t>DB_USER = os.environ.get('DB_USER')</w:t>
+        <w:br/>
+        <w:t>DB_PASSWORD = os.environ.get('DB_PASSWORD')</w:t>
+        <w:br/>
+        <w:br/>
+        <w:t>def lambda_handler(event, context):</w:t>
+        <w:br/>
+        <w:t xml:space="preserve">    """</w:t>
+        <w:br/>
+        <w:t xml:space="preserve">    Ingests and sanitizes streamside LoRa telemetry from API Gateway POST requests.</w:t>
+        <w:br/>
+        <w:t xml:space="preserve">    Calculates derived metrics and inserts them into PostgreSQL TimescaleDB hypertable.</w:t>
+        <w:br/>
+        <w:t xml:space="preserve">    """</w:t>
+        <w:br/>
+        <w:t xml:space="preserve">    try:</w:t>
+        <w:br/>
+        <w:t xml:space="preserve">        # 1. Parse and validate JSON input</w:t>
+        <w:br/>
+        <w:t xml:space="preserve">        body = json.loads(event.get('body', '{}'))</w:t>
+        <w:br/>
+        <w:t xml:space="preserve">        metadata = body.get('metadata', {})</w:t>
+        <w:br/>
+        <w:t xml:space="preserve">        telemetry = body.get('telemetry', {})</w:t>
+        <w:br/>
+        <w:t xml:space="preserve">        </w:t>
+        <w:br/>
+        <w:t xml:space="preserve">        station_id = metadata.get('station')</w:t>
+        <w:br/>
+        <w:t xml:space="preserve">        timestamp_str = telemetry.get('timestamp')</w:t>
+        <w:br/>
+        <w:t xml:space="preserve">        water_temp_c = float(telemetry.get('water_temp_c'))</w:t>
+        <w:br/>
+        <w:t xml:space="preserve">        dissolved_oxygen = float(telemetry.get('dissolved_oxygen_mg_l'))</w:t>
+        <w:br/>
+        <w:t xml:space="preserve">        water_level_m = float(telemetry.get('water_level_m'))</w:t>
+        <w:br/>
+        <w:t xml:space="preserve">        turbidity = float(telemetry.get('turbidity_ntu'))</w:t>
+        <w:br/>
+        <w:t xml:space="preserve">        battery_mv = int(telemetry.get('battery_voltage_mv', 0))</w:t>
+        <w:br/>
+        <w:t xml:space="preserve">        rssi = int(telemetry.get('rssi_dbm', 0))</w:t>
+        <w:br/>
+        <w:t xml:space="preserve">        </w:t>
+        <w:br/>
+        <w:t xml:space="preserve">        if not station_id or not timestamp_str:</w:t>
+        <w:br/>
+        <w:t xml:space="preserve">            return {"statusCode": 400, "body": json.dumps({"error": "Missing key parameters."})}</w:t>
+        <w:br/>
         <w:t xml:space="preserve">            </w:t>
         <w:br/>
-        <w:t xml:space="preserve">    except requests.exceptions.RequestException as e:</w:t>
-        <w:br/>
-        <w:t xml:space="preserve">        print(f"Data-sharing API connection timed out: {e}")</w:t>
+        <w:t xml:space="preserve">        # 2. Input Sanitization &amp; Range Checks</w:t>
+        <w:br/>
+        <w:t xml:space="preserve">        if not (-10.0 &lt;= water_temp_c &lt;= 40.0):</w:t>
+        <w:br/>
+        <w:t xml:space="preserve">            return {"statusCode": 400, "body": json.dumps({"error": "Temperature out of bounds."})}</w:t>
+        <w:br/>
+        <w:t xml:space="preserve">        if not (0.0 &lt;= dissolved_oxygen &lt;= 25.0):</w:t>
+        <w:br/>
+        <w:t xml:space="preserve">            return {"statusCode": 400, "body": json.dumps({"error": "DO out of bounds."})}</w:t>
+        <w:br/>
+        <w:t xml:space="preserve">        if not (0.0 &lt;= water_level_m &lt;= 10.0):</w:t>
+        <w:br/>
+        <w:t xml:space="preserve">            return {"statusCode": 400, "body": json.dumps({"error": "Flow level out of bounds."})}</w:t>
+        <w:br/>
+        <w:t xml:space="preserve">        if not (0.0 &lt;= turbidity &lt;= 1000.0):</w:t>
+        <w:br/>
+        <w:t xml:space="preserve">            return {"statusCode": 400, "body": json.dumps({"error": "Turbidity out of bounds."})}</w:t>
+        <w:br/>
+        <w:t xml:space="preserve">            </w:t>
+        <w:br/>
+        <w:t xml:space="preserve">        # 3. Calculate derived metrics</w:t>
+        <w:br/>
+        <w:t xml:space="preserve">        water_temp_f = (water_temp_c * 9.0/5.0) + 32.0</w:t>
+        <w:br/>
+        <w:t xml:space="preserve">        </w:t>
+        <w:br/>
+        <w:t xml:space="preserve">        # Calculate Wading Safety status</w:t>
+        <w:br/>
+        <w:t xml:space="preserve">        if water_level_m &lt;= 0.50:</w:t>
+        <w:br/>
+        <w:t xml:space="preserve">            wading_safety = "SAFE_TO_WADE"</w:t>
+        <w:br/>
+        <w:t xml:space="preserve">        elif water_level_m &lt;= 0.85:</w:t>
+        <w:br/>
+        <w:t xml:space="preserve">            wading_safety = "CAUTION_WADING"</w:t>
+        <w:br/>
+        <w:t xml:space="preserve">        else:</w:t>
+        <w:br/>
+        <w:t xml:space="preserve">            wading_safety = "HAZARDOUS_HIGH_FLOW"</w:t>
+        <w:br/>
+        <w:t xml:space="preserve">            </w:t>
+        <w:br/>
+        <w:t xml:space="preserve">        # Calculate Flow Status</w:t>
+        <w:br/>
+        <w:t xml:space="preserve">        if water_level_m &lt;= 0.20:</w:t>
+        <w:br/>
+        <w:t xml:space="preserve">            flow_status = "CRITICAL_LOW_FLOW"</w:t>
+        <w:br/>
+        <w:t xml:space="preserve">        elif water_level_m &lt;= 0.60:</w:t>
+        <w:br/>
+        <w:t xml:space="preserve">            flow_status = "NORMAL_BASE_FLOW"</w:t>
+        <w:br/>
+        <w:t xml:space="preserve">        else:</w:t>
+        <w:br/>
+        <w:t xml:space="preserve">            flow_status = "HIGH_SPATE_FLOW"</w:t>
+        <w:br/>
+        <w:t xml:space="preserve">            </w:t>
+        <w:br/>
+        <w:t xml:space="preserve">        # 4. Insert into PostgreSQL RDS database</w:t>
+        <w:br/>
+        <w:t xml:space="preserve">        conn = psycopg2.connect(</w:t>
+        <w:br/>
+        <w:t xml:space="preserve">            host=DB_HOST,</w:t>
+        <w:br/>
+        <w:t xml:space="preserve">            database=DB_NAME,</w:t>
+        <w:br/>
+        <w:t xml:space="preserve">            user=DB_USER,</w:t>
+        <w:br/>
+        <w:t xml:space="preserve">            password=DB_PASSWORD,</w:t>
+        <w:br/>
+        <w:t xml:space="preserve">            connect_timeout=3</w:t>
+        <w:br/>
+        <w:t xml:space="preserve">        )</w:t>
+        <w:br/>
+        <w:t xml:space="preserve">        cursor = conn.cursor()</w:t>
+        <w:br/>
+        <w:t xml:space="preserve">        </w:t>
+        <w:br/>
+        <w:t xml:space="preserve">        insert_query = """</w:t>
+        <w:br/>
+        <w:t xml:space="preserve">        INSERT INTO stream_telemetry_logs (</w:t>
+        <w:br/>
+        <w:t xml:space="preserve">            timestamp, station_id, water_temp_c, water_temp_f, </w:t>
+        <w:br/>
+        <w:t xml:space="preserve">            dissolved_oxygen_mg_l, stage_level_m, turbidity_ntu, </w:t>
+        <w:br/>
+        <w:t xml:space="preserve">            battery_voltage_mv, rssi_dbm, flow_status, wading_safety</w:t>
+        <w:br/>
+        <w:t xml:space="preserve">        ) VALUES (%s, %s, %s, %s, %s, %s, %s, %s, %s, %s, %s);</w:t>
+        <w:br/>
+        <w:t xml:space="preserve">        """</w:t>
+        <w:br/>
+        <w:t xml:space="preserve">        </w:t>
+        <w:br/>
+        <w:t xml:space="preserve">        cursor.execute(insert_query, (</w:t>
+        <w:br/>
+        <w:t xml:space="preserve">            timestamp_str, station_id, water_temp_c, water_temp_f,</w:t>
+        <w:br/>
+        <w:t xml:space="preserve">            dissolved_oxygen, water_level_m, turbidity,</w:t>
+        <w:br/>
+        <w:t xml:space="preserve">            battery_mv, rssi, flow_status, wading_safety</w:t>
+        <w:br/>
+        <w:t xml:space="preserve">        ))</w:t>
+        <w:br/>
+        <w:t xml:space="preserve">        </w:t>
+        <w:br/>
+        <w:t xml:space="preserve">        conn.commit()</w:t>
+        <w:br/>
+        <w:t xml:space="preserve">        cursor.close()</w:t>
+        <w:br/>
+        <w:t xml:space="preserve">        conn.close()</w:t>
+        <w:br/>
+        <w:t xml:space="preserve">        </w:t>
+        <w:br/>
+        <w:t xml:space="preserve">        return {</w:t>
+        <w:br/>
+        <w:t xml:space="preserve">            "statusCode": 200,</w:t>
+        <w:br/>
+        <w:t xml:space="preserve">            "headers": {"Content-Type": "application/json"},</w:t>
+        <w:br/>
+        <w:t xml:space="preserve">            "body": json.dumps({</w:t>
+        <w:br/>
+        <w:t xml:space="preserve">                "status": "SUCCESS",</w:t>
+        <w:br/>
+        <w:t xml:space="preserve">                "station": station_id,</w:t>
+        <w:br/>
+        <w:t xml:space="preserve">                "recorded_at": timestamp_str,</w:t>
+        <w:br/>
+        <w:t xml:space="preserve">                "derived": {</w:t>
+        <w:br/>
+        <w:t xml:space="preserve">                    "wading_safety": wading_safety,</w:t>
+        <w:br/>
+        <w:t xml:space="preserve">                    "flow_status": flow_status</w:t>
+        <w:br/>
+        <w:t xml:space="preserve">                }</w:t>
+        <w:br/>
+        <w:t xml:space="preserve">            })</w:t>
+        <w:br/>
+        <w:t xml:space="preserve">        }</w:t>
+        <w:br/>
+        <w:t xml:space="preserve">        </w:t>
+        <w:br/>
+        <w:t xml:space="preserve">    except Exception as e:</w:t>
+        <w:br/>
+        <w:t xml:space="preserve">        return {</w:t>
+        <w:br/>
+        <w:t xml:space="preserve">            "statusCode": 500,</w:t>
+        <w:br/>
+        <w:t xml:space="preserve">            "body": json.dumps({"error": f"Internal database error: {str(e)}"})</w:t>
+        <w:br/>
+        <w:t xml:space="preserve">        }</w:t>
+      </w:r>
+    </w:p>
+    <w:p>
+      <w:pPr>
+        <w:spacing w:after="240"/>
+      </w:pPr>
+      <w:r>
+        <w:rPr>
+          <w:color w:val="D9D9D9"/>
+        </w:rPr>
+        <w:t>____________________________________________________</w:t>
+      </w:r>
+    </w:p>
+    <w:p>
+      <w:pPr>
+        <w:spacing w:before="360" w:after="120"/>
+      </w:pPr>
+      <w:r>
+        <w:rPr>
+          <w:b/>
+          <w:color w:val="2E75B6"/>
+          <w:sz w:val="32"/>
+        </w:rPr>
+        <w:t>VII. Government-Friendly Data-Sharing &amp; Federal Compliance Standards</w:t>
+      </w:r>
+    </w:p>
+    <w:p>
+      <w:r>
+        <w:t xml:space="preserve">To make our geomorphic and chemical datasets highly credible, accessible, and "government-friendly" for official state and federal partners—such as the </w:t>
+      </w:r>
+      <w:r>
+        <w:rPr>
+          <w:b/>
+        </w:rPr>
+        <w:t>Georgia Environmental Protection Division (EPD)</w:t>
+      </w:r>
+      <w:r>
+        <w:t xml:space="preserve">, the </w:t>
+      </w:r>
+      <w:r>
+        <w:rPr>
+          <w:b/>
+        </w:rPr>
+        <w:t>USACE Savannah District</w:t>
+      </w:r>
+      <w:r>
+        <w:t xml:space="preserve">, and the </w:t>
+      </w:r>
+      <w:r>
+        <w:rPr>
+          <w:b/>
+        </w:rPr>
+        <w:t>US Geological Survey (USGS)</w:t>
+      </w:r>
+      <w:r>
+        <w:t>—our API core conforms strictly to standardized federal environmental data schemas and metadata rules. By adopting these standards, our stream restoration data can be ingested directly into official GIS mapping suites and federal databases.</w:t>
+      </w:r>
+    </w:p>
+    <w:p>
+      <w:pPr>
+        <w:spacing w:before="240" w:after="80"/>
+      </w:pPr>
+      <w:r>
+        <w:rPr>
+          <w:b/>
+          <w:color w:val="595959"/>
+          <w:sz w:val="26"/>
+        </w:rPr>
+        <w:t>1. US EPA WQX (Water Quality Exchange) Data Schema Compliance</w:t>
+      </w:r>
+    </w:p>
+    <w:p>
+      <w:r>
+        <w:t xml:space="preserve">The Environmental Protection Agency (EPA) and USGS aggregate national stream data via the </w:t>
+      </w:r>
+      <w:r>
+        <w:rPr>
+          <w:b/>
+        </w:rPr>
+        <w:t>Water Quality Exchange (WQX)</w:t>
+      </w:r>
+      <w:r>
+        <w:t xml:space="preserve"> framework. Our database exports water chemistry parameters matching the exact WQX XML and JSON Schema specifications, enabling direct ingress into the national </w:t>
+      </w:r>
+      <w:r>
+        <w:rPr>
+          <w:b/>
+        </w:rPr>
+        <w:t>Water Quality Portal (WQP)</w:t>
+      </w:r>
+      <w:r>
+        <w:t>:</w:t>
+      </w:r>
+    </w:p>
+    <w:p>
+      <w:pPr>
+        <w:pStyle w:val="ListBullet"/>
+        <w:spacing w:after="60"/>
+      </w:pPr>
+      <w:r/>
+      <w:r>
+        <w:rPr>
+          <w:b/>
+        </w:rPr>
+        <w:t>Standard Location Monikers</w:t>
+      </w:r>
+      <w:r>
+        <w:t>: We map our stations to standard USGS identifiers. For example, `BRSR-LO-101` maps to an EPA WQX-compliant format using Hydrologic Unit Codes (HUC-8): `US_EPA-BRSR-06020003-AC01` (Upper Toccoa basin, Anderson Creek Station 1).</w:t>
+      </w:r>
+    </w:p>
+    <w:p>
+      <w:pPr>
+        <w:pStyle w:val="ListBullet"/>
+        <w:spacing w:after="60"/>
+      </w:pPr>
+      <w:r/>
+      <w:r>
+        <w:rPr>
+          <w:b/>
+        </w:rPr>
+        <w:t>Vetted EPA Substance Identifiers</w:t>
+      </w:r>
+      <w:r>
+        <w:t>: We structure our JSON-LD and REST payloads using standardized chemical monikers from the EPA's *Substance Registry Services (SRS)*:</w:t>
+      </w:r>
+    </w:p>
+    <w:p>
+      <w:pPr>
+        <w:pStyle w:val="ListBullet"/>
+        <w:spacing w:after="60"/>
+      </w:pPr>
+      <w:r>
+        <w:t>*Water Temperature*: Standardized under SRS Name: `Temperature, water` (Unit: `deg F` or `deg C`).</w:t>
+      </w:r>
+    </w:p>
+    <w:p>
+      <w:pPr>
+        <w:pStyle w:val="ListBullet"/>
+        <w:spacing w:after="60"/>
+      </w:pPr>
+      <w:r>
+        <w:t>*Dissolved Oxygen*: Standardized under SRS Name: `Dissolved oxygen (DO)` (Unit: `mg/l`).</w:t>
+      </w:r>
+    </w:p>
+    <w:p>
+      <w:pPr>
+        <w:pStyle w:val="ListBullet"/>
+        <w:spacing w:after="60"/>
+      </w:pPr>
+      <w:r>
+        <w:t>*Water Stage Level*: Standardized under SRS Name: `Height, gauge` (Unit: `m` or `ft`).</w:t>
+      </w:r>
+    </w:p>
+    <w:p>
+      <w:pPr>
+        <w:pStyle w:val="ListBullet"/>
+        <w:spacing w:after="60"/>
+      </w:pPr>
+      <w:r>
+        <w:t>*Turbidity*: Standardized under SRS Name: `Turbidity` (Unit: `NTU`).</w:t>
+      </w:r>
+    </w:p>
+    <w:p>
+      <w:pPr>
+        <w:spacing w:before="240" w:after="80"/>
+      </w:pPr>
+      <w:r>
+        <w:rPr>
+          <w:b/>
+          <w:color w:val="595959"/>
+          <w:sz w:val="26"/>
+        </w:rPr>
+        <w:t>2. Semantic Data Modeling: JSON-LD Hydrological Observatory</w:t>
+      </w:r>
+    </w:p>
+    <w:p>
+      <w:r>
+        <w:t xml:space="preserve">To allow search engines, federal crawlers, and university crawlers to automatically discover, index, and query our restoration datasets, our public API injects </w:t>
+      </w:r>
+      <w:r>
+        <w:rPr>
+          <w:b/>
+        </w:rPr>
+        <w:t>JSON-LD (Linked Data)</w:t>
+      </w:r>
+      <w:r>
+        <w:t xml:space="preserve"> semantic markup conforming to the schema vocabulary for a `HydrologicalObservatory`:</w:t>
+      </w:r>
+    </w:p>
+    <w:p>
+      <w:pPr>
+        <w:spacing w:before="120" w:after="120"/>
+        <w:ind w:left="360"/>
+      </w:pPr>
+      <w:r>
+        <w:rPr>
+          <w:rFonts w:ascii="Consolas" w:hAnsi="Consolas"/>
+          <w:color w:val="7F0055"/>
+          <w:sz w:val="19"/>
+        </w:rPr>
+        <w:t>{</w:t>
+        <w:br/>
+        <w:t xml:space="preserve">  "@context": {</w:t>
+        <w:br/>
+        <w:t xml:space="preserve">    "schema": "http://schema.org/",</w:t>
+        <w:br/>
+        <w:t xml:space="preserve">    "sosa": "http://www.w3.org/ns/sosa/",</w:t>
+        <w:br/>
+        <w:t xml:space="preserve">    "qudt": "http://qudt.org/schema/qudt/"</w:t>
+        <w:br/>
+        <w:t xml:space="preserve">  },</w:t>
+        <w:br/>
+        <w:t xml:space="preserve">  "@type": "schema:HydrologicalObservatory",</w:t>
+        <w:br/>
+        <w:t xml:space="preserve">  "@id": "https://api.blueridgestream.com/stations/BRSR-LO-101",</w:t>
+        <w:br/>
+        <w:t xml:space="preserve">  "schema:name": "Anderson Creek Coldwater Spawning Bio-Reserve Station 1",</w:t>
+        <w:br/>
+        <w:t xml:space="preserve">  "schema:identifier": "BRSR-LO-101",</w:t>
+        <w:br/>
+        <w:t xml:space="preserve">  "schema:provider": {</w:t>
+        <w:br/>
+        <w:t xml:space="preserve">    "@type": "schema:Organization",</w:t>
+        <w:br/>
+        <w:t xml:space="preserve">    "schema:name": "Blue Ridge Stream Restoration &amp; Mitigation LLC"</w:t>
+        <w:br/>
+        <w:t xml:space="preserve">  },</w:t>
+        <w:br/>
+        <w:t xml:space="preserve">  "schema:geo": {</w:t>
+        <w:br/>
+        <w:t xml:space="preserve">    "@type": "schema:GeoCoordinates",</w:t>
+        <w:br/>
+        <w:t xml:space="preserve">    "schema:latitude": 34.78912,</w:t>
+        <w:br/>
+        <w:t xml:space="preserve">    "schema:longitude": -84.31245</w:t>
+        <w:br/>
+        <w:t xml:space="preserve">  },</w:t>
+        <w:br/>
+        <w:t xml:space="preserve">  "schema:observationArea": {</w:t>
+        <w:br/>
+        <w:t xml:space="preserve">    "@type": "schema:AdministrativeArea",</w:t>
+        <w:br/>
+        <w:t xml:space="preserve">    "schema:name": "Upper Toccoa River Basin HUC-8 06020003"</w:t>
+        <w:br/>
+        <w:t xml:space="preserve">  },</w:t>
+        <w:br/>
+        <w:t xml:space="preserve">  "sosa:hosts": [</w:t>
+        <w:br/>
+        <w:t xml:space="preserve">    {</w:t>
+        <w:br/>
+        <w:t xml:space="preserve">      "@type": "sosa:Sensor",</w:t>
+        <w:br/>
+        <w:t xml:space="preserve">      "schema:name": "Optical Dissolved Oxygen Probe",</w:t>
+        <w:br/>
+        <w:t xml:space="preserve">      "sosa:observes": "http://sweetontology.net/propQuantity/DissolvedOxygen"</w:t>
+        <w:br/>
+        <w:t xml:space="preserve">    },</w:t>
+        <w:br/>
+        <w:t xml:space="preserve">    {</w:t>
+        <w:br/>
+        <w:t xml:space="preserve">      "@type": "sosa:Sensor",</w:t>
+        <w:br/>
+        <w:t xml:space="preserve">      "schema:name": "Hydrostatic Water Stage Transmitter",</w:t>
+        <w:br/>
+        <w:t xml:space="preserve">      "sosa:observes": "http://sweetontology.net/propQuantity/WaterLevel"</w:t>
+        <w:br/>
+        <w:t xml:space="preserve">    }</w:t>
+        <w:br/>
+        <w:t xml:space="preserve">  ]</w:t>
+        <w:br/>
+        <w:t>}</w:t>
+      </w:r>
+    </w:p>
+    <w:p>
+      <w:pPr>
+        <w:spacing w:before="240" w:after="80"/>
+      </w:pPr>
+      <w:r>
+        <w:rPr>
+          <w:b/>
+          <w:color w:val="595959"/>
+          <w:sz w:val="26"/>
+        </w:rPr>
+        <w:t>3. Open Standards Integration &amp; GIS Delivery (ISO 19115 Compliance)</w:t>
+      </w:r>
+    </w:p>
+    <w:p>
+      <w:r>
+        <w:t>To ensure immediate readiness for government GIS engineers working in ArcGIS or QGIS, we implement these open-standard delivery formats:</w:t>
+      </w:r>
+    </w:p>
+    <w:p>
+      <w:pPr>
+        <w:pStyle w:val="ListBullet"/>
+        <w:spacing w:after="60"/>
+      </w:pPr>
+      <w:r/>
+      <w:r>
+        <w:rPr>
+          <w:b/>
+        </w:rPr>
+        <w:t>OpenAPI 3.0 / Swagger Definitions</w:t>
+      </w:r>
+      <w:r>
+        <w:t>: Our API endpoints publish complete Swagger configurations (`swagger.json`). This allows government IT systems to auto-generate secure client libraries and ingress agents with zero manual coding.</w:t>
+      </w:r>
+    </w:p>
+    <w:p>
+      <w:pPr>
+        <w:pStyle w:val="ListBullet"/>
+        <w:spacing w:after="60"/>
+      </w:pPr>
+      <w:r/>
+      <w:r>
+        <w:rPr>
+          <w:b/>
+        </w:rPr>
+        <w:t>Geospatial Standards (GeoJSON)</w:t>
+      </w:r>
+      <w:r>
+        <w:t xml:space="preserve">: Our public spatial endpoints output data in standard </w:t>
+      </w:r>
+      <w:r>
+        <w:rPr>
+          <w:b/>
+        </w:rPr>
+        <w:t>GeoJSON format</w:t>
+      </w:r>
+      <w:r>
+        <w:t xml:space="preserve"> (`GET /api/v1/stations.geojson`), letting state and county land planning departments add a live "BRSR Thermal Refuge Spawning Reservoirs" layer directly into their GIS map portals.</w:t>
+      </w:r>
+    </w:p>
+    <w:p>
+      <w:pPr>
+        <w:pStyle w:val="ListBullet"/>
+        <w:spacing w:after="60"/>
+      </w:pPr>
+      <w:r/>
+      <w:r>
+        <w:rPr>
+          <w:b/>
+        </w:rPr>
+        <w:t>ISO 19115 Metadata Standards</w:t>
+      </w:r>
+      <w:r>
+        <w:t>: Every CSV or Excel telemetry data download includes a secondary self-documenting XML metadata header complying with the federal geographic data committee (FGDC) ISO 19115 standard. This outlines the sensor models, accuracy tolerances, calibration dates, and data processing history to ensure our stream parameters are fully admissible in regulatory buffer variance or environmental mitigation hearings.</w:t>
       </w:r>
     </w:p>
     <w:p>

</xml_diff>